<commit_message>
fix(bpm): revise bai-tap 01 Cau 2/3 to Dumas customer framework
Original answer put Purchasing Department as customer, contradicting the
Dumas definition taught in class (customer = the party whose state changes
via the process, not an actor executing it). Reviewing chap01.pdf
confirmed slide 12 defines process by "value delivered to customer" and
the machine-repair example bookends the process with customer at both
ends. This is also inconsistent with last week's BuildIT answer where
site engineer was correctly identified as customer.

Cau 2: rewrite - state diagram is missing customer, real customer is
the end-user department raising the requisition (outside diagram);
Warehouse offered as proxy on the diagram itself.
Cau 3: realign value points to end-user department as customer.

Also add chap01.pdf as source reference and rebuild output.
</commit_message>
<xml_diff>
--- a/2026-07-07/output/24730090.docx
+++ b/2026-07-07/output/24730090.docx
@@ -213,7 +213,7 @@
         <w:rPr>
           <w:color w:val="000000"/>
         </w:rPr>
-        <w:t xml:space="preserve">Trong nội bộ doanh nghiệp, customer của process procurement này là Purchasing Department, vì họ chính là bên phát sinh nhu cầu mua sắm và là bên nhận được kết quả cuối cùng (hàng hoá đã nhập kho, chứng từ đã thanh toán). Purchasing Department thường mua thay cho các phòng ban sử dụng cuối như sản xuất, R&amp;D hay vận hành; do đó những phòng ban đó cũng có thể được xem là customer gián tiếp của process, dù họ không xuất hiện trực tiếp trong sơ đồ.</w:t>
+        <w:t xml:space="preserve">Một quy trình được kích hoạt bởi một nhu cầu và tạo ra kết quả có giá trị cho khách hàng, nên customer là bên có state thay đổi nhờ quy trình - có nhu cầu ở đầu và nhận được value ở cuối - chứ không phải bên thực thi bên trong quy trình. Áp dụng cách hiểu này vào sơ đồ đề bài thì sơ đồ chưa vẽ ra customer thật sự.</w:t>
       </w:r>
     </w:p>
     <w:p>
@@ -224,7 +224,18 @@
         <w:rPr>
           <w:color w:val="000000"/>
         </w:rPr>
-        <w:t xml:space="preserve">Vendor không phải customer của process này, mặc dù có nhận payment. Lý do là process được thiết kế để phục vụ nhu cầu mua hàng của doanh nghiệp, còn vendor chỉ đóng vai trò supplier. Value chảy về phía doanh nghiệp, không chảy về phía vendor. Warehouse Department và Accounts Payable Department là hai bộ phận thực thi trong process, không phải customer, vì họ làm việc để phục vụ nhu cầu mua hàng chứ không phải là bên sinh ra nhu cầu.</w:t>
+        <w:t xml:space="preserve">Trong quy trình procure-to-pay, customer là các phòng ban sử dụng cuối - sản xuất, R&amp;D, dự án hay công trường - đã gửi purchase requisition. Họ là bên có nhu cầu (thiếu vật tư để làm việc) và là bên nhận value cuối cùng (được có vật tư để dùng). Purchasing Department chỉ tiếp nhận requisition đó rồi thực thi thay, tương tự cách clerk trong bài BuildIT tuần trước xử lý request cho site engineer.</w:t>
+      </w:r>
+    </w:p>
+    <w:p>
+      <w:pPr>
+        <w:pStyle w:val="BodyText"/>
+      </w:pPr>
+      <w:r>
+        <w:rPr>
+          <w:color w:val="000000"/>
+        </w:rPr>
+        <w:t xml:space="preserve">Vì vậy, trong 4 actor được vẽ trên sơ đồ (Purchasing, Warehouse, Accounts Payable, Vendor), không có ai đúng nghĩa là customer. Purchasing, Warehouse và Accounts Payable đều là bộ phận nội bộ cùng phối hợp thực thi việc mua hàng - họ tạo ra value chứ không tiêu thụ value. Vendor càng không phải customer vì họ nhận payment với tư cách nhà cung cấp, value chảy về phía doanh nghiệp mua chứ không về phía vendor. Nếu bắt buộc phải chọn một actor trên sơ đồ gần vai trò customer nhất, em nghĩ Warehouse Department là proxy hợp lý vì kho là nơi value materialise (hàng vật lý về đến chỗ có thể sử dụng) trước khi được cấp phát tiếp cho end-user; nhưng đây chỉ là proxy, customer thật vẫn nằm ngoài sơ đồ.</w:t>
       </w:r>
     </w:p>
     <w:bookmarkEnd w:id="10"/>
@@ -248,7 +259,7 @@
         <w:rPr>
           <w:color w:val="000000"/>
         </w:rPr>
-        <w:t xml:space="preserve">Đối với Purchasing Department (và các phòng ban sử dụng cuối), process này mang lại các giá trị sau:</w:t>
+        <w:t xml:space="preserve">Với customer là các phòng ban sử dụng cuối, quy trình này mang lại các giá trị sau:</w:t>
       </w:r>
     </w:p>
     <w:p>
@@ -263,7 +274,7 @@
         <w:rPr>
           <w:color w:val="000000"/>
         </w:rPr>
-        <w:t xml:space="preserve">Đúng hàng, đủ số lượng: hàng do vendor giao được kiểm tra tại kho, đối chiếu với PO và Shipment Notice, đảm bảo khớp với yêu cầu ban đầu.</w:t>
+        <w:t xml:space="preserve">Có đúng vật tư, đủ số lượng để làm việc: hàng do vendor giao được kiểm tra tại kho, đối chiếu với PO và Shipment Notice, đảm bảo khớp với yêu cầu ban đầu trước khi được cấp phát cho phòng ban.</w:t>
       </w:r>
     </w:p>
     <w:p>
@@ -278,7 +289,7 @@
         <w:rPr>
           <w:color w:val="000000"/>
         </w:rPr>
-        <w:t xml:space="preserve">Đúng thời điểm: process cho phép theo dõi từ lúc PO gửi đi đến lúc hàng vào kho, giúp customer chủ động về thời gian sử dụng.</w:t>
+        <w:t xml:space="preserve">Có vật tư đúng thời điểm cần dùng: process cho phép theo dõi từ lúc PO gửi đi đến lúc hàng vào kho, end-user chủ động lập kế hoạch công việc theo tiến độ đó.</w:t>
       </w:r>
     </w:p>
     <w:p>
@@ -293,7 +304,7 @@
         <w:rPr>
           <w:color w:val="000000"/>
         </w:rPr>
-        <w:t xml:space="preserve">Chi phí được kiểm soát: có PO ràng buộc trước, có đối chiếu ba bên (PO - Shipment Notice - Payment) trước khi thanh toán, hạn chế chi sai và chi trùng.</w:t>
+        <w:t xml:space="preserve">Không phải tự làm phần backoffice: end-user chỉ cần gửi requisition rồi nhận hàng; toàn bộ chọn vendor, phát PO, nhận hàng, xử lý invoice và thanh toán đều do Purchasing/Warehouse/AP làm giúp. Đây là value quan trọng nhất - end-user tập trung vào chuyên môn thay vì làm mua sắm.</w:t>
       </w:r>
     </w:p>
     <w:p>
@@ -308,7 +319,7 @@
         <w:rPr>
           <w:color w:val="000000"/>
         </w:rPr>
-        <w:t xml:space="preserve">Giao dịch minh bạch: mọi bước ghi nhận vào Purchasing Database, phòng ban nào cũng truy được lịch sử đơn hàng, hàng nhận và thanh toán khi cần.</w:t>
+        <w:t xml:space="preserve">Chi phí và chứng từ hợp lệ: có PO ràng buộc trước, có đối chiếu ba bên (PO - Shipment Notice - Payment) trước khi thanh toán, hạn chế chi sai và chi trùng.</w:t>
       </w:r>
     </w:p>
     <w:p>
@@ -323,7 +334,7 @@
         <w:rPr>
           <w:color w:val="000000"/>
         </w:rPr>
-        <w:t xml:space="preserve">Customer không phải tự làm việc với vendor: thương lượng, phát hành PO, nhận hàng, xử lý invoice và thanh toán đều do các bộ phận chuyên trách xử lý.</w:t>
+        <w:t xml:space="preserve">Có thể tra soát khi cần: mọi bước ghi nhận vào Purchasing Database, nếu end-user cần biết đơn đang ở giai đoạn nào hoặc đã chi bao nhiêu thì có dấu vết để tra.</w:t>
       </w:r>
     </w:p>
     <w:p>
@@ -334,7 +345,7 @@
         <w:rPr>
           <w:color w:val="000000"/>
         </w:rPr>
-        <w:t xml:space="preserve">Nói ngắn gọn, giá trị process mang lại là mua được đúng hàng, đúng thời điểm, đúng giá và có đủ chứng từ hợp lệ mà customer không phải trực tiếp làm việc với vendor.</w:t>
+        <w:t xml:space="preserve">Nói cách khác, giá trị chính không phải là "mua được hàng" (điều đó end-user có thể tự đi mua) mà là "có hàng đúng, đúng lúc, đúng chi phí mà không phải trực tiếp làm việc với vendor" - đúng theo tinh thần tiêu chuẩn hóa, giảm chi phí và tăng chất lượng của BPM.</w:t>
       </w:r>
     </w:p>
     <w:bookmarkEnd w:id="11"/>

</xml_diff>

<commit_message>
refactor(bai-tap): update brief and solution for purchasing process analysis
- Revised brief title and clarified requirements for the purchasing process analysis.
- Enhanced the structure of the solution document, adding headings for clarity and detailing the roles of actors in the process.
- Specified output format and updated deadlines.
- Included additional context and value points for the process, emphasizing the roles of internal departments and the vendor.
- Updated output files to reflect the latest changes.
</commit_message>
<xml_diff>
--- a/2026-07-07/output/24730090.docx
+++ b/2026-07-07/output/24730090.docx
@@ -60,7 +60,7 @@
         <w:t xml:space="preserve">GVHD: Hà Lê Hoài Trung</w:t>
       </w:r>
     </w:p>
-    <w:bookmarkStart w:id="13" w:name="bài-tập-01"/>
+    <w:bookmarkStart w:id="13" w:name="X0915053925d48ea9dc65f148868c5e1b3dff6ed"/>
     <w:p>
       <w:pPr>
         <w:pStyle w:val="Heading1"/>
@@ -69,7 +69,7 @@
         <w:rPr>
           <w:color w:val="000000"/>
         </w:rPr>
-        <w:t xml:space="preserve">Bài tập 01</w:t>
+        <w:t xml:space="preserve">Bài tập 01 - Phân tích quy trình mua hàng</w:t>
       </w:r>
     </w:p>
     <w:p>
@@ -80,10 +80,34 @@
         <w:rPr>
           <w:color w:val="000000"/>
         </w:rPr>
-        <w:t xml:space="preserve">Sơ đồ mô tả một quy trình procure-to-pay của doanh nghiệp. Purchasing Department gửi Purchasing Order sang Vendor, Vendor giao hàng kèm Shipment Notice cho Warehouse Department, Accounts Payable Department (quy mô 120 người) chuyển Payment cho Vendor. Cả ba phòng ban đều đọc và ghi vào Purchasing Database dùng chung. Em phân tích quy trình theo 4 câu hỏi được đề bài đưa ra.</w:t>
+        <w:t xml:space="preserve">Họ tên: Nguyễn Ngọc Danh</w:t>
+      </w:r>
+      <w:r>
+        <w:rPr>
+          <w:color w:val="000000"/>
+        </w:rPr>
+        <w:t xml:space="preserve"> </w:t>
+      </w:r>
+      <w:r>
+        <w:rPr>
+          <w:color w:val="000000"/>
+        </w:rPr>
+        <w:t xml:space="preserve">MSSV: 24730090</w:t>
+      </w:r>
+      <w:r>
+        <w:rPr>
+          <w:color w:val="000000"/>
+        </w:rPr>
+        <w:t xml:space="preserve"> </w:t>
+      </w:r>
+      <w:r>
+        <w:rPr>
+          <w:color w:val="000000"/>
+        </w:rPr>
+        <w:t xml:space="preserve">Môn: Hệ thống quản trị qui trình nghiệp vụ</w:t>
       </w:r>
     </w:p>
-    <w:bookmarkStart w:id="9" w:name="câu-1.-actors-trong-process"/>
+    <w:bookmarkStart w:id="9" w:name="các-actor-tham-gia-quy-trình"/>
     <w:p>
       <w:pPr>
         <w:pStyle w:val="Heading2"/>
@@ -92,7 +116,7 @@
         <w:rPr>
           <w:color w:val="000000"/>
         </w:rPr>
-        <w:t xml:space="preserve">Câu 1. Actors trong process</w:t>
+        <w:t xml:space="preserve">1. Các actor tham gia quy trình</w:t>
       </w:r>
     </w:p>
     <w:p>
@@ -103,82 +127,53 @@
         <w:rPr>
           <w:color w:val="000000"/>
         </w:rPr>
-        <w:t xml:space="preserve">Trong sơ đồ có bốn actor tham gia trực tiếp và một hệ thống dữ liệu dùng chung:</w:t>
+        <w:t xml:space="preserve">Nhìn vào sơ đồ, em thấy quy trình mua hàng có bốn nhóm actor rõ rệt cùng một thành phần dữ liệu dùng chung.</w:t>
       </w:r>
     </w:p>
     <w:p>
       <w:pPr>
-        <w:pStyle w:val="Compact"/>
-        <w:numPr>
-          <w:ilvl w:val="0"/>
-          <w:numId w:val="1001"/>
-        </w:numPr>
+        <w:pStyle w:val="BodyText"/>
       </w:pPr>
       <w:r>
         <w:rPr>
           <w:color w:val="000000"/>
         </w:rPr>
-        <w:t xml:space="preserve">Purchasing Department: bộ phận mua hàng, phát sinh nhu cầu và tạo Purchasing Order gửi cho vendor.</w:t>
+        <w:t xml:space="preserve">Bên trong công ty có ba phòng ban. Purchasing Department (phòng mua hàng) là bên khởi tạo quy trình: khi có nhu cầu mua, phòng này lập Purchasing Order rồi gửi cho Vendor. Warehouse Department (phòng kho) chịu trách nhiệm tiếp nhận hàng từ Vendor cùng với Shipment Notice, kiểm tra và nhập kho. Accounts Payable Department (phòng công nợ phải trả) với quy mô 120 người phụ trách kiểm tra chứng từ rồi chi Payment cho Vendor.</w:t>
       </w:r>
     </w:p>
     <w:p>
       <w:pPr>
-        <w:pStyle w:val="Compact"/>
-        <w:numPr>
-          <w:ilvl w:val="0"/>
-          <w:numId w:val="1001"/>
-        </w:numPr>
+        <w:pStyle w:val="BodyText"/>
       </w:pPr>
       <w:r>
         <w:rPr>
           <w:color w:val="000000"/>
         </w:rPr>
-        <w:t xml:space="preserve">Warehouse Department: bộ phận kho, nhận hàng vật lý cùng Shipment Notice từ vendor và ghi nhận nhập kho.</w:t>
+        <w:t xml:space="preserve">Bên ngoài công ty có Vendor - nhà cung cấp. Vendor nhận đơn đặt hàng, giao hàng kèm Shipment Notice cho kho, và nhận tiền thanh toán từ phòng công nợ.</w:t>
       </w:r>
     </w:p>
     <w:p>
       <w:pPr>
-        <w:pStyle w:val="Compact"/>
-        <w:numPr>
-          <w:ilvl w:val="0"/>
-          <w:numId w:val="1001"/>
-        </w:numPr>
+        <w:pStyle w:val="BodyText"/>
       </w:pPr>
       <w:r>
         <w:rPr>
           <w:color w:val="000000"/>
         </w:rPr>
-        <w:t xml:space="preserve">Vendor: nhà cung cấp bên ngoài doanh nghiệp, nhận PO, giao hàng và nhận payment. Đây là external actor.</w:t>
+        <w:t xml:space="preserve">Purchasing Database không phải actor theo nghĩa "người thực hiện" mà là kho dữ liệu dùng chung. Cả ba phòng ban nội bộ đều đọc/ghi vào đây: phòng mua ghi đơn hàng, phòng kho cập nhật trạng thái nhận hàng, phòng công nợ đối chiếu số liệu để thanh toán. Nó đóng vai trò hạ tầng thông tin để các actor phối hợp với nhau.</w:t>
       </w:r>
     </w:p>
+    <w:bookmarkEnd w:id="9"/>
+    <w:bookmarkStart w:id="10" w:name="actor-nào-là-customer-của-quy-trình"/>
     <w:p>
       <w:pPr>
-        <w:pStyle w:val="Compact"/>
-        <w:numPr>
-          <w:ilvl w:val="0"/>
-          <w:numId w:val="1001"/>
-        </w:numPr>
+        <w:pStyle w:val="Heading2"/>
       </w:pPr>
       <w:r>
         <w:rPr>
           <w:color w:val="000000"/>
         </w:rPr>
-        <w:t xml:space="preserve">Accounts Payable Department: bộ phận công nợ phải trả (quy mô 120 người), đối chiếu chứng từ và chi trả cho vendor.</w:t>
-      </w:r>
-    </w:p>
-    <w:p>
-      <w:pPr>
-        <w:pStyle w:val="Compact"/>
-        <w:numPr>
-          <w:ilvl w:val="0"/>
-          <w:numId w:val="1001"/>
-        </w:numPr>
-      </w:pPr>
-      <w:r>
-        <w:rPr>
-          <w:color w:val="000000"/>
-        </w:rPr>
-        <w:t xml:space="preserve">Purchasing Database: không phải actor mà là data store dùng chung để ba phòng ban trao đổi dữ liệu về đơn hàng, hàng nhận và thanh toán.</w:t>
+        <w:t xml:space="preserve">2. Actor nào là customer của quy trình</w:t>
       </w:r>
     </w:p>
     <w:p>
@@ -189,11 +184,33 @@
         <w:rPr>
           <w:color w:val="000000"/>
         </w:rPr>
-        <w:t xml:space="preserve">Nếu xét theo vai trò trong process thì Purchasing Department là actor khởi tạo, Warehouse là actor nhận hàng, Accounts Payable là actor thanh toán, còn Vendor là đối tác bên ngoài.</w:t>
+        <w:t xml:space="preserve">Trong BPM, customer của một quy trình là bên nhận giá trị đầu ra chứ không nhất thiết phải là khách hàng mua sản phẩm cuối cùng của công ty. Với quy trình mua hàng này em xác định hai customer.</w:t>
       </w:r>
     </w:p>
-    <w:bookmarkEnd w:id="9"/>
-    <w:bookmarkStart w:id="10" w:name="câu-2.-actors-nào-được-coi-là-customer"/>
+    <w:p>
+      <w:pPr>
+        <w:pStyle w:val="BodyText"/>
+      </w:pPr>
+      <w:r>
+        <w:rPr>
+          <w:color w:val="000000"/>
+        </w:rPr>
+        <w:t xml:space="preserve">Warehouse Department là customer nội bộ và cũng là customer chính. Kho là nơi cần hàng để phục vụ cho các hoạt động tiếp theo (sản xuất hoặc bán ra). Toàn bộ quy trình sinh ra để trả lời câu hỏi "làm sao đưa đúng hàng vào kho đúng lúc", nên đầu ra hàng hóa hướng thẳng đến kho.</w:t>
+      </w:r>
+    </w:p>
+    <w:p>
+      <w:pPr>
+        <w:pStyle w:val="BodyText"/>
+      </w:pPr>
+      <w:r>
+        <w:rPr>
+          <w:color w:val="000000"/>
+        </w:rPr>
+        <w:t xml:space="preserve">Vendor có thể coi là customer thứ hai theo một góc nhìn khác. Đầu ra Payment của quy trình chảy về phía Vendor, và Vendor kỳ vọng nhận đúng số tiền, đúng hạn. Nếu tách quy trình con "thanh toán cho nhà cung cấp" ra riêng thì Vendor là customer của quy trình con đó. Trong bài này em vẫn xếp Vendor là customer phụ để bao quát cả dòng tiền, còn customer trọng tâm vẫn là Warehouse.</w:t>
+      </w:r>
+    </w:p>
+    <w:bookmarkEnd w:id="10"/>
+    <w:bookmarkStart w:id="11" w:name="X8d4ef244bcb32a88d9b25c99cdfe37d910c0803"/>
     <w:p>
       <w:pPr>
         <w:pStyle w:val="Heading2"/>
@@ -202,7 +219,7 @@
         <w:rPr>
           <w:color w:val="000000"/>
         </w:rPr>
-        <w:t xml:space="preserve">Câu 2. Actors nào được coi là customer</w:t>
+        <w:t xml:space="preserve">3. Giá trị mà quy trình mang lại cho customer</w:t>
       </w:r>
     </w:p>
     <w:p>
@@ -213,7 +230,7 @@
         <w:rPr>
           <w:color w:val="000000"/>
         </w:rPr>
-        <w:t xml:space="preserve">Một quy trình được kích hoạt bởi một nhu cầu và tạo ra kết quả có giá trị cho khách hàng, nên customer là bên có state thay đổi nhờ quy trình - có nhu cầu ở đầu và nhận được value ở cuối - chứ không phải bên thực thi bên trong quy trình. Áp dụng cách hiểu này vào sơ đồ đề bài thì sơ đồ chưa vẽ ra customer thật sự.</w:t>
+        <w:t xml:space="preserve">Với Warehouse Department, giá trị nằm ở việc kho nhận được đúng loại hàng, đủ số lượng, đúng thời điểm mà không phải tự đi tìm nhà cung cấp hay đàm phán giá. Kèm theo đó, kho nhận Shipment Notice trước hoặc cùng lúc với hàng nên có thể chuẩn bị chỗ chứa, nhân sự bốc dỡ và đối chiếu nhanh khi hàng về. Purchasing Database giúp kho tra cứu lịch sử đơn hàng, biết lô nào của nhà cung cấp nào, tiện cho việc truy vết chất lượng khi cần.</w:t>
       </w:r>
     </w:p>
     <w:p>
@@ -224,7 +241,7 @@
         <w:rPr>
           <w:color w:val="000000"/>
         </w:rPr>
-        <w:t xml:space="preserve">Trong quy trình procure-to-pay, customer là các phòng ban sử dụng cuối - sản xuất, R&amp;D, dự án hay công trường - đã gửi purchase requisition. Họ là bên có nhu cầu (thiếu vật tư để làm việc) và là bên nhận value cuối cùng (được có vật tư để dùng). Purchasing Department chỉ tiếp nhận requisition đó rồi thực thi thay, tương tự cách clerk trong bài BuildIT tuần trước xử lý request cho site engineer.</w:t>
+        <w:t xml:space="preserve">Với Vendor, giá trị là dòng doanh thu ổn định qua kênh Payment sau khi giao hàng đúng cam kết. Vendor cũng nhận được Purchasing Order rõ ràng nên biết chính xác cần chuẩn bị gì, tránh làm sai đơn.</w:t>
       </w:r>
     </w:p>
     <w:p>
@@ -235,11 +252,11 @@
         <w:rPr>
           <w:color w:val="000000"/>
         </w:rPr>
-        <w:t xml:space="preserve">Vì vậy, trong 4 actor được vẽ trên sơ đồ (Purchasing, Warehouse, Accounts Payable, Vendor), không có ai đúng nghĩa là customer. Purchasing, Warehouse và Accounts Payable đều là bộ phận nội bộ cùng phối hợp thực thi việc mua hàng - họ tạo ra value chứ không tiêu thụ value. Vendor càng không phải customer vì họ nhận payment với tư cách nhà cung cấp, value chảy về phía doanh nghiệp mua chứ không về phía vendor. Nếu bắt buộc phải chọn một actor trên sơ đồ gần vai trò customer nhất, em nghĩ Warehouse Department là proxy hợp lý vì kho là nơi value materialise (hàng vật lý về đến chỗ có thể sử dụng) trước khi được cấp phát tiếp cho end-user; nhưng đây chỉ là proxy, customer thật vẫn nằm ngoài sơ đồ.</w:t>
+        <w:t xml:space="preserve">Nhìn ở tầng công ty, quy trình còn tạo ra giá trị gián tiếp là dữ liệu mua hàng được ghi lại có hệ thống, phục vụ cho báo cáo tài chính, kiểm soát chi phí và đàm phán lại giá với nhà cung cấp ở kỳ sau.</w:t>
       </w:r>
     </w:p>
-    <w:bookmarkEnd w:id="10"/>
-    <w:bookmarkStart w:id="11" w:name="Xaa21de2db8eccfa21b0708bfa91d05aeafef666"/>
+    <w:bookmarkEnd w:id="11"/>
+    <w:bookmarkStart w:id="12" w:name="X13d1bbfa923f223a2808ddb0e8203bac963a882"/>
     <w:p>
       <w:pPr>
         <w:pStyle w:val="Heading2"/>
@@ -248,7 +265,7 @@
         <w:rPr>
           <w:color w:val="000000"/>
         </w:rPr>
-        <w:t xml:space="preserve">Câu 3. Value process mang lại cho customer</w:t>
+        <w:t xml:space="preserve">4. Các kết cục có thể xảy ra khi quy trình kết thúc</w:t>
       </w:r>
     </w:p>
     <w:p>
@@ -259,218 +276,40 @@
         <w:rPr>
           <w:color w:val="000000"/>
         </w:rPr>
-        <w:t xml:space="preserve">Với customer là các phòng ban sử dụng cuối, quy trình này mang lại các giá trị sau:</w:t>
+        <w:t xml:space="preserve">Em chia thành hai nhánh outcome.</w:t>
       </w:r>
     </w:p>
     <w:p>
       <w:pPr>
-        <w:pStyle w:val="Compact"/>
-        <w:numPr>
-          <w:ilvl w:val="0"/>
-          <w:numId w:val="1002"/>
-        </w:numPr>
+        <w:pStyle w:val="BodyText"/>
       </w:pPr>
       <w:r>
         <w:rPr>
           <w:color w:val="000000"/>
         </w:rPr>
-        <w:t xml:space="preserve">Có đúng vật tư, đủ số lượng để làm việc: hàng do vendor giao được kiểm tra tại kho, đối chiếu với PO và Shipment Notice, đảm bảo khớp với yêu cầu ban đầu trước khi được cấp phát cho phòng ban.</w:t>
+        <w:t xml:space="preserve">Nhánh outcome mong muốn: đơn hàng hoàn tất trọn vẹn. Purchasing Order được Vendor chấp nhận, hàng giao đủ và đúng chất lượng, kho nhập vào Purchasing Database, phòng công nợ thanh toán thành công cho Vendor, dữ liệu công nợ được đóng sổ. Đây là kết thúc "happy path" mà quy trình hướng tới.</w:t>
       </w:r>
     </w:p>
     <w:p>
       <w:pPr>
-        <w:pStyle w:val="Compact"/>
-        <w:numPr>
-          <w:ilvl w:val="0"/>
-          <w:numId w:val="1002"/>
-        </w:numPr>
+        <w:pStyle w:val="BodyText"/>
       </w:pPr>
       <w:r>
         <w:rPr>
           <w:color w:val="000000"/>
         </w:rPr>
-        <w:t xml:space="preserve">Có vật tư đúng thời điểm cần dùng: process cho phép theo dõi từ lúc PO gửi đi đến lúc hàng vào kho, end-user chủ động lập kế hoạch công việc theo tiến độ đó.</w:t>
+        <w:t xml:space="preserve">Nhánh outcome không mong muốn xảy ra ở nhiều điểm khác nhau. Vendor có thể từ chối đơn hàng vì hết hàng hoặc giá đã đổi, khi đó quy trình kết thúc sớm ở bước đầu và phòng mua phải tìm nhà cung cấp khác. Hàng giao có thể thiếu, sai chủng loại, hoặc hư hỏng khi kiểm nhận: kho sẽ ghi nhận bất thường và trả lại một phần hoặc toàn bộ lô hàng, dẫn tới đơn hàng bị đóng ở trạng thái không hoàn tất. Ở khâu thanh toán, phòng công nợ có thể phát hiện sai lệch chứng từ (Shipment Notice không khớp Purchasing Order) khiến Payment bị treo, tạo tranh chấp công nợ với Vendor cho đến khi được đối chiếu xong.</w:t>
       </w:r>
     </w:p>
     <w:p>
       <w:pPr>
-        <w:pStyle w:val="Compact"/>
-        <w:numPr>
-          <w:ilvl w:val="0"/>
-          <w:numId w:val="1002"/>
-        </w:numPr>
+        <w:pStyle w:val="BodyText"/>
       </w:pPr>
       <w:r>
         <w:rPr>
           <w:color w:val="000000"/>
         </w:rPr>
-        <w:t xml:space="preserve">Không phải tự làm phần backoffice: end-user chỉ cần gửi requisition rồi nhận hàng; toàn bộ chọn vendor, phát PO, nhận hàng, xử lý invoice và thanh toán đều do Purchasing/Warehouse/AP làm giúp. Đây là value quan trọng nhất - end-user tập trung vào chuyên môn thay vì làm mua sắm.</w:t>
-      </w:r>
-    </w:p>
-    <w:p>
-      <w:pPr>
-        <w:pStyle w:val="Compact"/>
-        <w:numPr>
-          <w:ilvl w:val="0"/>
-          <w:numId w:val="1002"/>
-        </w:numPr>
-      </w:pPr>
-      <w:r>
-        <w:rPr>
-          <w:color w:val="000000"/>
-        </w:rPr>
-        <w:t xml:space="preserve">Chi phí và chứng từ hợp lệ: có PO ràng buộc trước, có đối chiếu ba bên (PO - Shipment Notice - Payment) trước khi thanh toán, hạn chế chi sai và chi trùng.</w:t>
-      </w:r>
-    </w:p>
-    <w:p>
-      <w:pPr>
-        <w:pStyle w:val="Compact"/>
-        <w:numPr>
-          <w:ilvl w:val="0"/>
-          <w:numId w:val="1002"/>
-        </w:numPr>
-      </w:pPr>
-      <w:r>
-        <w:rPr>
-          <w:color w:val="000000"/>
-        </w:rPr>
-        <w:t xml:space="preserve">Có thể tra soát khi cần: mọi bước ghi nhận vào Purchasing Database, nếu end-user cần biết đơn đang ở giai đoạn nào hoặc đã chi bao nhiêu thì có dấu vết để tra.</w:t>
-      </w:r>
-    </w:p>
-    <w:p>
-      <w:pPr>
-        <w:pStyle w:val="FirstParagraph"/>
-      </w:pPr>
-      <w:r>
-        <w:rPr>
-          <w:color w:val="000000"/>
-        </w:rPr>
-        <w:t xml:space="preserve">Nói cách khác, giá trị chính không phải là "mua được hàng" (điều đó end-user có thể tự đi mua) mà là "có hàng đúng, đúng lúc, đúng chi phí mà không phải trực tiếp làm việc với vendor" - đúng theo tinh thần tiêu chuẩn hóa, giảm chi phí và tăng chất lượng của BPM.</w:t>
-      </w:r>
-    </w:p>
-    <w:bookmarkEnd w:id="11"/>
-    <w:bookmarkStart w:id="12" w:name="câu-4.-các-outcome-có-thể-có-của-process"/>
-    <w:p>
-      <w:pPr>
-        <w:pStyle w:val="Heading2"/>
-      </w:pPr>
-      <w:r>
-        <w:rPr>
-          <w:color w:val="000000"/>
-        </w:rPr>
-        <w:t xml:space="preserve">Câu 4. Các outcome có thể có của process</w:t>
-      </w:r>
-    </w:p>
-    <w:p>
-      <w:pPr>
-        <w:pStyle w:val="FirstParagraph"/>
-      </w:pPr>
-      <w:r>
-        <w:rPr>
-          <w:color w:val="000000"/>
-        </w:rPr>
-        <w:t xml:space="preserve">Process có thể kết thúc ở một trong các trạng thái sau:</w:t>
-      </w:r>
-    </w:p>
-    <w:p>
-      <w:pPr>
-        <w:pStyle w:val="Compact"/>
-        <w:numPr>
-          <w:ilvl w:val="0"/>
-          <w:numId w:val="1003"/>
-        </w:numPr>
-      </w:pPr>
-      <w:r>
-        <w:rPr>
-          <w:color w:val="000000"/>
-        </w:rPr>
-        <w:t xml:space="preserve">Hoàn tất thành công: vendor giao đủ hàng, kho nhận đúng, Accounts Payable thanh toán đầy đủ. Purchasing Database ghi nhận đơn hàng closed.</w:t>
-      </w:r>
-    </w:p>
-    <w:p>
-      <w:pPr>
-        <w:pStyle w:val="Compact"/>
-        <w:numPr>
-          <w:ilvl w:val="0"/>
-          <w:numId w:val="1003"/>
-        </w:numPr>
-      </w:pPr>
-      <w:r>
-        <w:rPr>
-          <w:color w:val="000000"/>
-        </w:rPr>
-        <w:t xml:space="preserve">Thành công một phần: vendor chỉ giao được một phần đơn hàng (thiếu số lượng, thiếu chủng loại). Warehouse nhận phần đã giao, phần còn lại chờ hoặc huỷ; thanh toán tương ứng phần đã nhận.</w:t>
-      </w:r>
-    </w:p>
-    <w:p>
-      <w:pPr>
-        <w:pStyle w:val="Compact"/>
-        <w:numPr>
-          <w:ilvl w:val="0"/>
-          <w:numId w:val="1003"/>
-        </w:numPr>
-      </w:pPr>
-      <w:r>
-        <w:rPr>
-          <w:color w:val="000000"/>
-        </w:rPr>
-        <w:t xml:space="preserve">Vendor không giao được hàng: sau khi PO gửi đi, vendor báo hết hàng, không đáp ứng đúng hạn hoặc từ chối đơn hàng. Purchasing Department huỷ PO và mở process mới với vendor khác.</w:t>
-      </w:r>
-    </w:p>
-    <w:p>
-      <w:pPr>
-        <w:pStyle w:val="Compact"/>
-        <w:numPr>
-          <w:ilvl w:val="0"/>
-          <w:numId w:val="1003"/>
-        </w:numPr>
-      </w:pPr>
-      <w:r>
-        <w:rPr>
-          <w:color w:val="000000"/>
-        </w:rPr>
-        <w:t xml:space="preserve">Hàng bị từ chối tại kho: Warehouse kiểm tra thấy hàng không đạt (sai chủng loại, hư hỏng, không khớp Shipment Notice) và trả lại vendor. Có thể yêu cầu vendor giao lại hoặc huỷ PO.</w:t>
-      </w:r>
-    </w:p>
-    <w:p>
-      <w:pPr>
-        <w:pStyle w:val="Compact"/>
-        <w:numPr>
-          <w:ilvl w:val="0"/>
-          <w:numId w:val="1003"/>
-        </w:numPr>
-      </w:pPr>
-      <w:r>
-        <w:rPr>
-          <w:color w:val="000000"/>
-        </w:rPr>
-        <w:t xml:space="preserve">Sai lệch chứng từ, tạm giữ thanh toán: Accounts Payable đối chiếu PO - Shipment Notice - Invoice thấy chênh (số lượng, đơn giá, thuế) và tạm giữ payment cho đến khi được điều chỉnh. Nếu không giải quyết được thì payment bị huỷ và tranh chấp với vendor.</w:t>
-      </w:r>
-    </w:p>
-    <w:p>
-      <w:pPr>
-        <w:pStyle w:val="Compact"/>
-        <w:numPr>
-          <w:ilvl w:val="0"/>
-          <w:numId w:val="1003"/>
-        </w:numPr>
-      </w:pPr>
-      <w:r>
-        <w:rPr>
-          <w:color w:val="000000"/>
-        </w:rPr>
-        <w:t xml:space="preserve">Huỷ đơn từ phía Purchasing: nhu cầu thay đổi hoặc ngân sách bị rút, Purchasing Department huỷ PO trước khi vendor giao hàng.</w:t>
-      </w:r>
-    </w:p>
-    <w:p>
-      <w:pPr>
-        <w:pStyle w:val="FirstParagraph"/>
-      </w:pPr>
-      <w:r>
-        <w:rPr>
-          <w:color w:val="000000"/>
-        </w:rPr>
-        <w:t xml:space="preserve">Mỗi outcome đều để lại dấu vết trong Purchasing Database, giúp doanh nghiệp thống kê tỷ lệ đơn thành công, tỷ lệ trả hàng và tỷ lệ tranh chấp thanh toán để cải tiến process về sau.</w:t>
+        <w:t xml:space="preserve">Ngoài ra còn outcome trung tính là đơn hàng bị hủy giữa chừng do nhu cầu thay đổi từ phía công ty, ví dụ bên yêu cầu mua rút đề nghị trước khi Vendor kịp giao. Trường hợp này Purchasing Database vẫn phải ghi lại lý do hủy để phục vụ kiểm toán sau này.</w:t>
       </w:r>
     </w:p>
     <w:bookmarkEnd w:id="12"/>
@@ -757,109 +596,6 @@
       </w:pPr>
     </w:lvl>
   </w:abstractNum>
-  <w:abstractNum w:abstractNumId="991">
-    <w:nsid w:val="0000A991"/>
-    <w:multiLevelType w:val="multilevel"/>
-    <w:lvl w:ilvl="0">
-      <w:numFmt w:val="bullet"/>
-      <w:lvlText w:val=""/>
-      <w:lvlJc w:val="left"/>
-      <w:pPr>
-        <w:ind w:left="720" w:hanging="360"/>
-      </w:pPr>
-      <w:rPr>
-        <w:rFonts w:ascii="Symbol" w:hAnsi="Symbol" w:cs="Symbol" w:hint="default"/>
-      </w:rPr>
-    </w:lvl>
-    <w:lvl w:ilvl="1">
-      <w:numFmt w:val="bullet"/>
-      <w:lvlText w:val="o"/>
-      <w:lvlJc w:val="left"/>
-      <w:pPr>
-        <w:ind w:left="1440" w:hanging="360"/>
-      </w:pPr>
-      <w:rPr>
-        <w:rFonts w:ascii="Courier New" w:hAnsi="Courier New" w:cs="Courier New" w:hint="default"/>
-      </w:rPr>
-    </w:lvl>
-    <w:lvl w:ilvl="2">
-      <w:numFmt w:val="bullet"/>
-      <w:lvlText w:val=""/>
-      <w:lvlJc w:val="left"/>
-      <w:pPr>
-        <w:ind w:left="2160" w:hanging="360"/>
-      </w:pPr>
-      <w:rPr>
-        <w:rFonts w:ascii="Wingdings" w:hAnsi="Wingdings" w:cs="Wingdings" w:hint="default"/>
-      </w:rPr>
-    </w:lvl>
-    <w:lvl w:ilvl="3">
-      <w:numFmt w:val="bullet"/>
-      <w:lvlText w:val=""/>
-      <w:lvlJc w:val="left"/>
-      <w:pPr>
-        <w:ind w:left="2880" w:hanging="360"/>
-      </w:pPr>
-      <w:rPr>
-        <w:rFonts w:ascii="Symbol" w:hAnsi="Symbol" w:cs="Symbol" w:hint="default"/>
-      </w:rPr>
-    </w:lvl>
-    <w:lvl w:ilvl="4">
-      <w:numFmt w:val="bullet"/>
-      <w:lvlText w:val="o"/>
-      <w:lvlJc w:val="left"/>
-      <w:pPr>
-        <w:ind w:left="3600" w:hanging="360"/>
-      </w:pPr>
-      <w:rPr>
-        <w:rFonts w:ascii="Courier New" w:hAnsi="Courier New" w:cs="Courier New" w:hint="default"/>
-      </w:rPr>
-    </w:lvl>
-    <w:lvl w:ilvl="5">
-      <w:numFmt w:val="bullet"/>
-      <w:lvlText w:val=""/>
-      <w:lvlJc w:val="left"/>
-      <w:pPr>
-        <w:ind w:left="4320" w:hanging="360"/>
-      </w:pPr>
-      <w:rPr>
-        <w:rFonts w:ascii="Wingdings" w:hAnsi="Wingdings" w:cs="Wingdings" w:hint="default"/>
-      </w:rPr>
-    </w:lvl>
-    <w:lvl w:ilvl="6">
-      <w:numFmt w:val="bullet"/>
-      <w:lvlText w:val=""/>
-      <w:lvlJc w:val="left"/>
-      <w:pPr>
-        <w:ind w:left="5040" w:hanging="360"/>
-      </w:pPr>
-      <w:rPr>
-        <w:rFonts w:ascii="Symbol" w:hAnsi="Symbol" w:cs="Symbol" w:hint="default"/>
-      </w:rPr>
-    </w:lvl>
-    <w:lvl w:ilvl="7">
-      <w:numFmt w:val="bullet"/>
-      <w:lvlText w:val="o"/>
-      <w:lvlJc w:val="left"/>
-      <w:pPr>
-        <w:ind w:left="5760" w:hanging="360"/>
-      </w:pPr>
-      <w:rPr>
-        <w:rFonts w:ascii="Courier New" w:hAnsi="Courier New" w:cs="Courier New" w:hint="default"/>
-      </w:rPr>
-    </w:lvl>
-    <w:lvl w:ilvl="8">
-      <w:numFmt w:val="bullet"/>
-      <w:lvlText w:val=""/>
-      <w:lvlJc w:val="left"/>
-      <w:pPr>
-        <w:ind w:left="6480" w:hanging="360"/>
-      </w:pPr>
-      <w:rPr>
-        <w:rFonts w:ascii="Wingdings" w:hAnsi="Wingdings" w:cs="Wingdings" w:hint="default"/>
-      </w:rPr>
-    </w:lvl>
-  </w:abstractNum>
   <w:num w:numId="1">
     <w:abstractNumId w:val="8"/>
   </w:num>
@@ -889,15 +625,6 @@
   </w:num>
   <w:num w:numId="1000">
     <w:abstractNumId w:val="990"/>
-  </w:num>
-  <w:num w:numId="1001">
-    <w:abstractNumId w:val="991"/>
-  </w:num>
-  <w:num w:numId="1002">
-    <w:abstractNumId w:val="991"/>
-  </w:num>
-  <w:num w:numId="1003">
-    <w:abstractNumId w:val="991"/>
   </w:num>
 </w:numbering>
 </file>

</xml_diff>

<commit_message>
- Add kien-thuc-mon.md caches for 3 subjects (BPM, ATTT, Data Mining)   from pre-processed slides; PDFs stay local via updated .gitignore   (4 cross-subject rules: no header repeat, bullet for enumerations,   cite evidence chapter, no off-topic sentences) - Add /kien-thuc SKILL, check_fabrication.py, fetch_citd_slides.sh,   failure-modes research spec - Rewrite BPM bai-tap 2026-07-07 solution.md applying format+evidence   rules; rebuild 24730090.docx/pdf - Rewrite ATTT bai-tap 2026-07-08 solution.md (Defense in Depth +   8-technique attack table), 2 adversarial warnings fixed; rebuild   MEMORY.md index - Remove chap01.pdf from tracking (now sourced via kien-thuc-mon.md cache)
</commit_message>
<xml_diff>
--- a/2026-07-07/output/24730090.docx
+++ b/2026-07-07/output/24730090.docx
@@ -60,7 +60,7 @@
         <w:t xml:space="preserve">GVHD: Hà Lê Hoài Trung</w:t>
       </w:r>
     </w:p>
-    <w:bookmarkStart w:id="13" w:name="X0915053925d48ea9dc65f148868c5e1b3dff6ed"/>
+    <w:bookmarkStart w:id="13" w:name="bài-tập-01.-phân-tích-quy-trình-mua-hàng"/>
     <w:p>
       <w:pPr>
         <w:pStyle w:val="Heading1"/>
@@ -69,7 +69,7 @@
         <w:rPr>
           <w:color w:val="000000"/>
         </w:rPr>
-        <w:t xml:space="preserve">Bài tập 01 - Phân tích quy trình mua hàng</w:t>
+        <w:t xml:space="preserve">Bài tập 01. Phân tích quy trình mua hàng</w:t>
       </w:r>
     </w:p>
     <w:p>
@@ -80,34 +80,10 @@
         <w:rPr>
           <w:color w:val="000000"/>
         </w:rPr>
-        <w:t xml:space="preserve">Họ tên: Nguyễn Ngọc Danh</w:t>
-      </w:r>
-      <w:r>
-        <w:rPr>
-          <w:color w:val="000000"/>
-        </w:rPr>
-        <w:t xml:space="preserve"> </w:t>
-      </w:r>
-      <w:r>
-        <w:rPr>
-          <w:color w:val="000000"/>
-        </w:rPr>
-        <w:t xml:space="preserve">MSSV: 24730090</w:t>
-      </w:r>
-      <w:r>
-        <w:rPr>
-          <w:color w:val="000000"/>
-        </w:rPr>
-        <w:t xml:space="preserve"> </w:t>
-      </w:r>
-      <w:r>
-        <w:rPr>
-          <w:color w:val="000000"/>
-        </w:rPr>
-        <w:t xml:space="preserve">Môn: Hệ thống quản trị qui trình nghiệp vụ</w:t>
+        <w:t xml:space="preserve">Sơ đồ đề bài mô tả một quy trình mua hàng (procure-to-pay) ở doanh nghiệp. Purchasing Department phát Purchasing Order sang Vendor, Vendor giao hàng kèm Shipment Notice cho Warehouse Department, Accounts Payable Department (120 người) chuyển Payment cho Vendor. Ba phòng ban nội bộ đều đọc và ghi vào Purchasing Database dùng chung. Em phân tích quy trình theo 4 câu hỏi đề bài.</w:t>
       </w:r>
     </w:p>
-    <w:bookmarkStart w:id="9" w:name="các-actor-tham-gia-quy-trình"/>
+    <w:bookmarkStart w:id="9" w:name="câu-1.-actor-trong-process"/>
     <w:p>
       <w:pPr>
         <w:pStyle w:val="Heading2"/>
@@ -116,7 +92,7 @@
         <w:rPr>
           <w:color w:val="000000"/>
         </w:rPr>
-        <w:t xml:space="preserve">1. Các actor tham gia quy trình</w:t>
+        <w:t xml:space="preserve">Câu 1. Actor trong process</w:t>
       </w:r>
     </w:p>
     <w:p>
@@ -127,7 +103,117 @@
         <w:rPr>
           <w:color w:val="000000"/>
         </w:rPr>
-        <w:t xml:space="preserve">Nhìn vào sơ đồ, em thấy quy trình mua hàng có bốn nhóm actor rõ rệt cùng một thành phần dữ liệu dùng chung.</w:t>
+        <w:t xml:space="preserve">Sơ đồ có bốn actor tham gia trực tiếp và một hệ thống dữ liệu dùng chung:</w:t>
+      </w:r>
+    </w:p>
+    <w:p>
+      <w:pPr>
+        <w:pStyle w:val="Compact"/>
+        <w:numPr>
+          <w:ilvl w:val="0"/>
+          <w:numId w:val="1001"/>
+        </w:numPr>
+      </w:pPr>
+      <w:r>
+        <w:rPr>
+          <w:color w:val="000000"/>
+        </w:rPr>
+        <w:t xml:space="preserve">Purchasing Department: bộ phận mua hàng, khởi tạo quy trình bằng cách phát Purchasing Order dựa trên nhu cầu bên trong công ty.</w:t>
+      </w:r>
+    </w:p>
+    <w:p>
+      <w:pPr>
+        <w:pStyle w:val="Compact"/>
+        <w:numPr>
+          <w:ilvl w:val="0"/>
+          <w:numId w:val="1001"/>
+        </w:numPr>
+      </w:pPr>
+      <w:r>
+        <w:rPr>
+          <w:color w:val="000000"/>
+        </w:rPr>
+        <w:t xml:space="preserve">Warehouse Department: bộ phận kho, tiếp nhận hàng vật lý cùng Shipment Notice từ Vendor, kiểm tra và ghi nhận nhập kho.</w:t>
+      </w:r>
+    </w:p>
+    <w:p>
+      <w:pPr>
+        <w:pStyle w:val="Compact"/>
+        <w:numPr>
+          <w:ilvl w:val="0"/>
+          <w:numId w:val="1001"/>
+        </w:numPr>
+      </w:pPr>
+      <w:r>
+        <w:rPr>
+          <w:color w:val="000000"/>
+        </w:rPr>
+        <w:t xml:space="preserve">Accounts Payable Department: bộ phận công nợ phải trả với quy mô 120 người, đối chiếu chứng từ (PO, Shipment Notice, hóa đơn) rồi chi Payment cho Vendor.</w:t>
+      </w:r>
+    </w:p>
+    <w:p>
+      <w:pPr>
+        <w:pStyle w:val="Compact"/>
+        <w:numPr>
+          <w:ilvl w:val="0"/>
+          <w:numId w:val="1001"/>
+        </w:numPr>
+      </w:pPr>
+      <w:r>
+        <w:rPr>
+          <w:color w:val="000000"/>
+        </w:rPr>
+        <w:t xml:space="preserve">Vendor: actor duy nhất nằm ngoài công ty, nhận PO, giao hàng đúng đơn và nhận thanh toán.</w:t>
+      </w:r>
+    </w:p>
+    <w:p>
+      <w:pPr>
+        <w:pStyle w:val="Compact"/>
+        <w:numPr>
+          <w:ilvl w:val="0"/>
+          <w:numId w:val="1001"/>
+        </w:numPr>
+      </w:pPr>
+      <w:r>
+        <w:rPr>
+          <w:color w:val="000000"/>
+        </w:rPr>
+        <w:t xml:space="preserve">Purchasing Database: không phải actor mà là data store dùng chung để ba phòng ban trao đổi dữ liệu về đơn hàng, hàng nhận và công nợ.</w:t>
+      </w:r>
+    </w:p>
+    <w:p>
+      <w:pPr>
+        <w:pStyle w:val="FirstParagraph"/>
+      </w:pPr>
+      <w:r>
+        <w:rPr>
+          <w:color w:val="000000"/>
+        </w:rPr>
+        <w:t xml:space="preserve">Xét theo vai trò trong process: Purchasing là actor khởi tạo, Warehouse là actor nhận hàng, Accounts Payable là actor thanh toán, Vendor là đối tác bên ngoài.</w:t>
+      </w:r>
+    </w:p>
+    <w:bookmarkEnd w:id="9"/>
+    <w:bookmarkStart w:id="10" w:name="câu-2.-actor-nào-được-coi-là-customer"/>
+    <w:p>
+      <w:pPr>
+        <w:pStyle w:val="Heading2"/>
+      </w:pPr>
+      <w:r>
+        <w:rPr>
+          <w:color w:val="000000"/>
+        </w:rPr>
+        <w:t xml:space="preserve">Câu 2. Actor nào được coi là customer</w:t>
+      </w:r>
+    </w:p>
+    <w:p>
+      <w:pPr>
+        <w:pStyle w:val="FirstParagraph"/>
+      </w:pPr>
+      <w:r>
+        <w:rPr>
+          <w:color w:val="000000"/>
+        </w:rPr>
+        <w:t xml:space="preserve">Theo định nghĩa trong bài giảng chương 1, một quy trình được kích hoạt bởi một nhu cầu và tạo ra kết quả có giá trị cho khách hàng. Từ đó suy ra customer là bên có nhu cầu ở đầu quy trình và nhận value ở cuối, tức là bên có state thay đổi vì quy trình chạy. Bên chỉ thực thi các bước bên trong (executor) thì không phải customer, họ tạo ra value chứ không tiêu thụ. Áp cách hiểu này vào sơ đồ đề bài thì sơ đồ chưa vẽ ra customer thật sự.</w:t>
       </w:r>
     </w:p>
     <w:p>
@@ -138,7 +224,7 @@
         <w:rPr>
           <w:color w:val="000000"/>
         </w:rPr>
-        <w:t xml:space="preserve">Bên trong công ty có ba phòng ban. Purchasing Department (phòng mua hàng) là bên khởi tạo quy trình: khi có nhu cầu mua, phòng này lập Purchasing Order rồi gửi cho Vendor. Warehouse Department (phòng kho) chịu trách nhiệm tiếp nhận hàng từ Vendor cùng với Shipment Notice, kiểm tra và nhập kho. Accounts Payable Department (phòng công nợ phải trả) với quy mô 120 người phụ trách kiểm tra chứng từ rồi chi Payment cho Vendor.</w:t>
+        <w:t xml:space="preserve">Trong một quy trình procure-to-pay, customer là các phòng ban sử dụng cuối như sản xuất, R&amp;D, dự án hay công trường, tức là bên đã gửi purchase requisition ban đầu. Họ có nhu cầu (thiếu vật tư để làm việc) và nhận value cuối cùng (được có vật tư để dùng). Purchasing Department chỉ tiếp nhận requisition đó rồi thực thi thay, tương tự bài BuildIT ở chương 5 (Analysis), nơi clerk và works engineer là executor xử lý request thuê thiết bị, còn customer thật là site engineer bên có nhu cầu thiếu thiết bị.</w:t>
       </w:r>
     </w:p>
     <w:p>
@@ -149,22 +235,11 @@
         <w:rPr>
           <w:color w:val="000000"/>
         </w:rPr>
-        <w:t xml:space="preserve">Bên ngoài công ty có Vendor - nhà cung cấp. Vendor nhận đơn đặt hàng, giao hàng kèm Shipment Notice cho kho, và nhận tiền thanh toán từ phòng công nợ.</w:t>
+        <w:t xml:space="preserve">Vì vậy, trong 4 actor được vẽ trên sơ đồ (Purchasing, Warehouse, Accounts Payable, Vendor), không có ai đúng nghĩa là customer. Purchasing, Warehouse và Accounts Payable đều là bộ phận nội bộ cùng phối hợp thực thi việc mua hàng, họ tạo ra value chứ không tiêu thụ. Vendor càng không phải customer vì họ nhận payment với tư cách nhà cung cấp, value chảy về phía doanh nghiệp mua chứ không về phía Vendor. Nếu bắt buộc chọn một actor trên sơ đồ gần vai trò customer nhất, em nghĩ Warehouse Department là proxy hợp lý vì kho là nơi value materialise (hàng vật lý về đến chỗ có thể sử dụng) trước khi được cấp phát cho end-user. Đây chỉ là proxy, customer thật vẫn nằm ngoài sơ đồ.</w:t>
       </w:r>
     </w:p>
-    <w:p>
-      <w:pPr>
-        <w:pStyle w:val="BodyText"/>
-      </w:pPr>
-      <w:r>
-        <w:rPr>
-          <w:color w:val="000000"/>
-        </w:rPr>
-        <w:t xml:space="preserve">Purchasing Database không phải actor theo nghĩa "người thực hiện" mà là kho dữ liệu dùng chung. Cả ba phòng ban nội bộ đều đọc/ghi vào đây: phòng mua ghi đơn hàng, phòng kho cập nhật trạng thái nhận hàng, phòng công nợ đối chiếu số liệu để thanh toán. Nó đóng vai trò hạ tầng thông tin để các actor phối hợp với nhau.</w:t>
-      </w:r>
-    </w:p>
-    <w:bookmarkEnd w:id="9"/>
-    <w:bookmarkStart w:id="10" w:name="actor-nào-là-customer-của-quy-trình"/>
+    <w:bookmarkEnd w:id="10"/>
+    <w:bookmarkStart w:id="11" w:name="Xaa21de2db8eccfa21b0708bfa91d05aeafef666"/>
     <w:p>
       <w:pPr>
         <w:pStyle w:val="Heading2"/>
@@ -173,7 +248,7 @@
         <w:rPr>
           <w:color w:val="000000"/>
         </w:rPr>
-        <w:t xml:space="preserve">2. Actor nào là customer của quy trình</w:t>
+        <w:t xml:space="preserve">Câu 3. Value process mang lại cho customer</w:t>
       </w:r>
     </w:p>
     <w:p>
@@ -184,42 +259,82 @@
         <w:rPr>
           <w:color w:val="000000"/>
         </w:rPr>
-        <w:t xml:space="preserve">Trong BPM, customer của một quy trình là bên nhận giá trị đầu ra chứ không nhất thiết phải là khách hàng mua sản phẩm cuối cùng của công ty. Với quy trình mua hàng này em xác định hai customer.</w:t>
+        <w:t xml:space="preserve">Với customer là các phòng ban sử dụng cuối, quy trình mang lại các giá trị sau:</w:t>
       </w:r>
     </w:p>
     <w:p>
       <w:pPr>
-        <w:pStyle w:val="BodyText"/>
+        <w:pStyle w:val="Compact"/>
+        <w:numPr>
+          <w:ilvl w:val="0"/>
+          <w:numId w:val="1002"/>
+        </w:numPr>
       </w:pPr>
       <w:r>
         <w:rPr>
           <w:color w:val="000000"/>
         </w:rPr>
-        <w:t xml:space="preserve">Warehouse Department là customer nội bộ và cũng là customer chính. Kho là nơi cần hàng để phục vụ cho các hoạt động tiếp theo (sản xuất hoặc bán ra). Toàn bộ quy trình sinh ra để trả lời câu hỏi "làm sao đưa đúng hàng vào kho đúng lúc", nên đầu ra hàng hóa hướng thẳng đến kho.</w:t>
+        <w:t xml:space="preserve">Có đúng vật tư, đủ số lượng để làm việc: hàng do Vendor giao được kiểm tra tại kho, đối chiếu với PO và Shipment Notice, đảm bảo khớp yêu cầu ban đầu trước khi cấp phát cho phòng ban.</w:t>
       </w:r>
     </w:p>
     <w:p>
       <w:pPr>
-        <w:pStyle w:val="BodyText"/>
+        <w:pStyle w:val="Compact"/>
+        <w:numPr>
+          <w:ilvl w:val="0"/>
+          <w:numId w:val="1002"/>
+        </w:numPr>
       </w:pPr>
       <w:r>
         <w:rPr>
           <w:color w:val="000000"/>
         </w:rPr>
-        <w:t xml:space="preserve">Vendor có thể coi là customer thứ hai theo một góc nhìn khác. Đầu ra Payment của quy trình chảy về phía Vendor, và Vendor kỳ vọng nhận đúng số tiền, đúng hạn. Nếu tách quy trình con "thanh toán cho nhà cung cấp" ra riêng thì Vendor là customer của quy trình con đó. Trong bài này em vẫn xếp Vendor là customer phụ để bao quát cả dòng tiền, còn customer trọng tâm vẫn là Warehouse.</w:t>
+        <w:t xml:space="preserve">Có vật tư đúng thời điểm cần dùng: process cho phép theo dõi từ lúc PO gửi đi đến lúc hàng vào kho, end-user chủ động lập kế hoạch công việc theo tiến độ đó.</w:t>
       </w:r>
     </w:p>
-    <w:bookmarkEnd w:id="10"/>
-    <w:bookmarkStart w:id="11" w:name="X8d4ef244bcb32a88d9b25c99cdfe37d910c0803"/>
     <w:p>
       <w:pPr>
-        <w:pStyle w:val="Heading2"/>
+        <w:pStyle w:val="Compact"/>
+        <w:numPr>
+          <w:ilvl w:val="0"/>
+          <w:numId w:val="1002"/>
+        </w:numPr>
       </w:pPr>
       <w:r>
         <w:rPr>
           <w:color w:val="000000"/>
         </w:rPr>
-        <w:t xml:space="preserve">3. Giá trị mà quy trình mang lại cho customer</w:t>
+        <w:t xml:space="preserve">Không phải tự làm phần backoffice: end-user chỉ cần gửi requisition rồi nhận hàng, toàn bộ chọn Vendor, phát PO, nhận hàng, xử lý invoice và thanh toán đều do Purchasing / Warehouse / AP làm giúp. Đây là value quan trọng nhất, end-user tập trung vào chuyên môn thay vì làm mua sắm.</w:t>
+      </w:r>
+    </w:p>
+    <w:p>
+      <w:pPr>
+        <w:pStyle w:val="Compact"/>
+        <w:numPr>
+          <w:ilvl w:val="0"/>
+          <w:numId w:val="1002"/>
+        </w:numPr>
+      </w:pPr>
+      <w:r>
+        <w:rPr>
+          <w:color w:val="000000"/>
+        </w:rPr>
+        <w:t xml:space="preserve">Chi phí và chứng từ hợp lệ: có PO ràng buộc trước, có đối chiếu ba bên (PO, Shipment Notice, hóa đơn) trước khi thanh toán, hạn chế chi sai và chi trùng.</w:t>
+      </w:r>
+    </w:p>
+    <w:p>
+      <w:pPr>
+        <w:pStyle w:val="Compact"/>
+        <w:numPr>
+          <w:ilvl w:val="0"/>
+          <w:numId w:val="1002"/>
+        </w:numPr>
+      </w:pPr>
+      <w:r>
+        <w:rPr>
+          <w:color w:val="000000"/>
+        </w:rPr>
+        <w:t xml:space="preserve">Có thể tra soát khi cần: mọi bước ghi nhận vào Purchasing Database, nếu end-user cần biết đơn đang ở giai đoạn nào hoặc đã chi bao nhiêu thì có dấu vết để tra.</w:t>
       </w:r>
     </w:p>
     <w:p>
@@ -230,33 +345,11 @@
         <w:rPr>
           <w:color w:val="000000"/>
         </w:rPr>
-        <w:t xml:space="preserve">Với Warehouse Department, giá trị nằm ở việc kho nhận được đúng loại hàng, đủ số lượng, đúng thời điểm mà không phải tự đi tìm nhà cung cấp hay đàm phán giá. Kèm theo đó, kho nhận Shipment Notice trước hoặc cùng lúc với hàng nên có thể chuẩn bị chỗ chứa, nhân sự bốc dỡ và đối chiếu nhanh khi hàng về. Purchasing Database giúp kho tra cứu lịch sử đơn hàng, biết lô nào của nhà cung cấp nào, tiện cho việc truy vết chất lượng khi cần.</w:t>
-      </w:r>
-    </w:p>
-    <w:p>
-      <w:pPr>
-        <w:pStyle w:val="BodyText"/>
-      </w:pPr>
-      <w:r>
-        <w:rPr>
-          <w:color w:val="000000"/>
-        </w:rPr>
-        <w:t xml:space="preserve">Với Vendor, giá trị là dòng doanh thu ổn định qua kênh Payment sau khi giao hàng đúng cam kết. Vendor cũng nhận được Purchasing Order rõ ràng nên biết chính xác cần chuẩn bị gì, tránh làm sai đơn.</w:t>
-      </w:r>
-    </w:p>
-    <w:p>
-      <w:pPr>
-        <w:pStyle w:val="BodyText"/>
-      </w:pPr>
-      <w:r>
-        <w:rPr>
-          <w:color w:val="000000"/>
-        </w:rPr>
-        <w:t xml:space="preserve">Nhìn ở tầng công ty, quy trình còn tạo ra giá trị gián tiếp là dữ liệu mua hàng được ghi lại có hệ thống, phục vụ cho báo cáo tài chính, kiểm soát chi phí và đàm phán lại giá với nhà cung cấp ở kỳ sau.</w:t>
+        <w:t xml:space="preserve">Nói cách khác, giá trị chính không phải là "mua được hàng" (điều đó end-user có thể tự đi mua) mà là "có hàng đúng, đúng lúc, đúng chi phí mà không phải trực tiếp làm việc với Vendor", đúng theo tinh thần tiêu chuẩn hóa, giảm chi phí và tăng chất lượng của BPM.</w:t>
       </w:r>
     </w:p>
     <w:bookmarkEnd w:id="11"/>
-    <w:bookmarkStart w:id="12" w:name="X13d1bbfa923f223a2808ddb0e8203bac963a882"/>
+    <w:bookmarkStart w:id="12" w:name="câu-4.-các-outcome-có-thể-có-của-process"/>
     <w:p>
       <w:pPr>
         <w:pStyle w:val="Heading2"/>
@@ -265,7 +358,7 @@
         <w:rPr>
           <w:color w:val="000000"/>
         </w:rPr>
-        <w:t xml:space="preserve">4. Các kết cục có thể xảy ra khi quy trình kết thúc</w:t>
+        <w:t xml:space="preserve">Câu 4. Các outcome có thể có của process</w:t>
       </w:r>
     </w:p>
     <w:p>
@@ -276,40 +369,108 @@
         <w:rPr>
           <w:color w:val="000000"/>
         </w:rPr>
-        <w:t xml:space="preserve">Em chia thành hai nhánh outcome.</w:t>
+        <w:t xml:space="preserve">Process có thể kết thúc ở một trong các trạng thái sau:</w:t>
       </w:r>
     </w:p>
     <w:p>
       <w:pPr>
-        <w:pStyle w:val="BodyText"/>
+        <w:pStyle w:val="Compact"/>
+        <w:numPr>
+          <w:ilvl w:val="0"/>
+          <w:numId w:val="1003"/>
+        </w:numPr>
       </w:pPr>
       <w:r>
         <w:rPr>
           <w:color w:val="000000"/>
         </w:rPr>
-        <w:t xml:space="preserve">Nhánh outcome mong muốn: đơn hàng hoàn tất trọn vẹn. Purchasing Order được Vendor chấp nhận, hàng giao đủ và đúng chất lượng, kho nhập vào Purchasing Database, phòng công nợ thanh toán thành công cho Vendor, dữ liệu công nợ được đóng sổ. Đây là kết thúc "happy path" mà quy trình hướng tới.</w:t>
+        <w:t xml:space="preserve">Hoàn tất thành công: Vendor giao đủ hàng, kho nhận đúng, Accounts Payable thanh toán đầy đủ. Purchasing Database ghi nhận đơn hàng closed.</w:t>
       </w:r>
     </w:p>
     <w:p>
       <w:pPr>
-        <w:pStyle w:val="BodyText"/>
+        <w:pStyle w:val="Compact"/>
+        <w:numPr>
+          <w:ilvl w:val="0"/>
+          <w:numId w:val="1003"/>
+        </w:numPr>
       </w:pPr>
       <w:r>
         <w:rPr>
           <w:color w:val="000000"/>
         </w:rPr>
-        <w:t xml:space="preserve">Nhánh outcome không mong muốn xảy ra ở nhiều điểm khác nhau. Vendor có thể từ chối đơn hàng vì hết hàng hoặc giá đã đổi, khi đó quy trình kết thúc sớm ở bước đầu và phòng mua phải tìm nhà cung cấp khác. Hàng giao có thể thiếu, sai chủng loại, hoặc hư hỏng khi kiểm nhận: kho sẽ ghi nhận bất thường và trả lại một phần hoặc toàn bộ lô hàng, dẫn tới đơn hàng bị đóng ở trạng thái không hoàn tất. Ở khâu thanh toán, phòng công nợ có thể phát hiện sai lệch chứng từ (Shipment Notice không khớp Purchasing Order) khiến Payment bị treo, tạo tranh chấp công nợ với Vendor cho đến khi được đối chiếu xong.</w:t>
+        <w:t xml:space="preserve">Thành công một phần: Vendor chỉ giao được một phần đơn hàng (thiếu số lượng, thiếu chủng loại). Warehouse nhận phần đã giao, phần còn lại chờ hoặc huỷ, thanh toán tương ứng phần đã nhận.</w:t>
       </w:r>
     </w:p>
     <w:p>
       <w:pPr>
-        <w:pStyle w:val="BodyText"/>
+        <w:pStyle w:val="Compact"/>
+        <w:numPr>
+          <w:ilvl w:val="0"/>
+          <w:numId w:val="1003"/>
+        </w:numPr>
       </w:pPr>
       <w:r>
         <w:rPr>
           <w:color w:val="000000"/>
         </w:rPr>
-        <w:t xml:space="preserve">Ngoài ra còn outcome trung tính là đơn hàng bị hủy giữa chừng do nhu cầu thay đổi từ phía công ty, ví dụ bên yêu cầu mua rút đề nghị trước khi Vendor kịp giao. Trường hợp này Purchasing Database vẫn phải ghi lại lý do hủy để phục vụ kiểm toán sau này.</w:t>
+        <w:t xml:space="preserve">Vendor không giao được hàng: sau khi PO gửi đi, Vendor báo hết hàng, không đáp ứng đúng hạn hoặc từ chối đơn hàng. Purchasing Department huỷ PO và mở process mới với Vendor khác.</w:t>
+      </w:r>
+    </w:p>
+    <w:p>
+      <w:pPr>
+        <w:pStyle w:val="Compact"/>
+        <w:numPr>
+          <w:ilvl w:val="0"/>
+          <w:numId w:val="1003"/>
+        </w:numPr>
+      </w:pPr>
+      <w:r>
+        <w:rPr>
+          <w:color w:val="000000"/>
+        </w:rPr>
+        <w:t xml:space="preserve">Hàng bị từ chối tại kho: Warehouse kiểm tra thấy hàng không đạt (sai chủng loại, hư hỏng, không khớp Shipment Notice) và trả lại Vendor. Có thể yêu cầu Vendor giao lại hoặc huỷ PO.</w:t>
+      </w:r>
+    </w:p>
+    <w:p>
+      <w:pPr>
+        <w:pStyle w:val="Compact"/>
+        <w:numPr>
+          <w:ilvl w:val="0"/>
+          <w:numId w:val="1003"/>
+        </w:numPr>
+      </w:pPr>
+      <w:r>
+        <w:rPr>
+          <w:color w:val="000000"/>
+        </w:rPr>
+        <w:t xml:space="preserve">Sai lệch chứng từ, tạm giữ thanh toán: Accounts Payable đối chiếu PO, Shipment Notice, Invoice thấy chênh (số lượng, đơn giá, thuế) và tạm giữ payment cho đến khi được điều chỉnh. Nếu không giải quyết được thì payment bị huỷ và tranh chấp với Vendor.</w:t>
+      </w:r>
+    </w:p>
+    <w:p>
+      <w:pPr>
+        <w:pStyle w:val="Compact"/>
+        <w:numPr>
+          <w:ilvl w:val="0"/>
+          <w:numId w:val="1003"/>
+        </w:numPr>
+      </w:pPr>
+      <w:r>
+        <w:rPr>
+          <w:color w:val="000000"/>
+        </w:rPr>
+        <w:t xml:space="preserve">Huỷ đơn từ phía Purchasing: nhu cầu thay đổi hoặc ngân sách bị rút, Purchasing Department huỷ PO trước khi Vendor giao hàng.</w:t>
+      </w:r>
+    </w:p>
+    <w:p>
+      <w:pPr>
+        <w:pStyle w:val="FirstParagraph"/>
+      </w:pPr>
+      <w:r>
+        <w:rPr>
+          <w:color w:val="000000"/>
+        </w:rPr>
+        <w:t xml:space="preserve">Mỗi outcome đều để lại dấu vết trong Purchasing Database, giúp doanh nghiệp thống kê tỷ lệ đơn thành công, tỷ lệ trả hàng và tỷ lệ tranh chấp thanh toán để cải tiến process về sau.</w:t>
       </w:r>
     </w:p>
     <w:bookmarkEnd w:id="12"/>
@@ -596,6 +757,109 @@
       </w:pPr>
     </w:lvl>
   </w:abstractNum>
+  <w:abstractNum w:abstractNumId="991">
+    <w:nsid w:val="0000A991"/>
+    <w:multiLevelType w:val="multilevel"/>
+    <w:lvl w:ilvl="0">
+      <w:numFmt w:val="bullet"/>
+      <w:lvlText w:val=""/>
+      <w:lvlJc w:val="left"/>
+      <w:pPr>
+        <w:ind w:left="720" w:hanging="360"/>
+      </w:pPr>
+      <w:rPr>
+        <w:rFonts w:ascii="Symbol" w:hAnsi="Symbol" w:cs="Symbol" w:hint="default"/>
+      </w:rPr>
+    </w:lvl>
+    <w:lvl w:ilvl="1">
+      <w:numFmt w:val="bullet"/>
+      <w:lvlText w:val="o"/>
+      <w:lvlJc w:val="left"/>
+      <w:pPr>
+        <w:ind w:left="1440" w:hanging="360"/>
+      </w:pPr>
+      <w:rPr>
+        <w:rFonts w:ascii="Courier New" w:hAnsi="Courier New" w:cs="Courier New" w:hint="default"/>
+      </w:rPr>
+    </w:lvl>
+    <w:lvl w:ilvl="2">
+      <w:numFmt w:val="bullet"/>
+      <w:lvlText w:val=""/>
+      <w:lvlJc w:val="left"/>
+      <w:pPr>
+        <w:ind w:left="2160" w:hanging="360"/>
+      </w:pPr>
+      <w:rPr>
+        <w:rFonts w:ascii="Wingdings" w:hAnsi="Wingdings" w:cs="Wingdings" w:hint="default"/>
+      </w:rPr>
+    </w:lvl>
+    <w:lvl w:ilvl="3">
+      <w:numFmt w:val="bullet"/>
+      <w:lvlText w:val=""/>
+      <w:lvlJc w:val="left"/>
+      <w:pPr>
+        <w:ind w:left="2880" w:hanging="360"/>
+      </w:pPr>
+      <w:rPr>
+        <w:rFonts w:ascii="Symbol" w:hAnsi="Symbol" w:cs="Symbol" w:hint="default"/>
+      </w:rPr>
+    </w:lvl>
+    <w:lvl w:ilvl="4">
+      <w:numFmt w:val="bullet"/>
+      <w:lvlText w:val="o"/>
+      <w:lvlJc w:val="left"/>
+      <w:pPr>
+        <w:ind w:left="3600" w:hanging="360"/>
+      </w:pPr>
+      <w:rPr>
+        <w:rFonts w:ascii="Courier New" w:hAnsi="Courier New" w:cs="Courier New" w:hint="default"/>
+      </w:rPr>
+    </w:lvl>
+    <w:lvl w:ilvl="5">
+      <w:numFmt w:val="bullet"/>
+      <w:lvlText w:val=""/>
+      <w:lvlJc w:val="left"/>
+      <w:pPr>
+        <w:ind w:left="4320" w:hanging="360"/>
+      </w:pPr>
+      <w:rPr>
+        <w:rFonts w:ascii="Wingdings" w:hAnsi="Wingdings" w:cs="Wingdings" w:hint="default"/>
+      </w:rPr>
+    </w:lvl>
+    <w:lvl w:ilvl="6">
+      <w:numFmt w:val="bullet"/>
+      <w:lvlText w:val=""/>
+      <w:lvlJc w:val="left"/>
+      <w:pPr>
+        <w:ind w:left="5040" w:hanging="360"/>
+      </w:pPr>
+      <w:rPr>
+        <w:rFonts w:ascii="Symbol" w:hAnsi="Symbol" w:cs="Symbol" w:hint="default"/>
+      </w:rPr>
+    </w:lvl>
+    <w:lvl w:ilvl="7">
+      <w:numFmt w:val="bullet"/>
+      <w:lvlText w:val="o"/>
+      <w:lvlJc w:val="left"/>
+      <w:pPr>
+        <w:ind w:left="5760" w:hanging="360"/>
+      </w:pPr>
+      <w:rPr>
+        <w:rFonts w:ascii="Courier New" w:hAnsi="Courier New" w:cs="Courier New" w:hint="default"/>
+      </w:rPr>
+    </w:lvl>
+    <w:lvl w:ilvl="8">
+      <w:numFmt w:val="bullet"/>
+      <w:lvlText w:val=""/>
+      <w:lvlJc w:val="left"/>
+      <w:pPr>
+        <w:ind w:left="6480" w:hanging="360"/>
+      </w:pPr>
+      <w:rPr>
+        <w:rFonts w:ascii="Wingdings" w:hAnsi="Wingdings" w:cs="Wingdings" w:hint="default"/>
+      </w:rPr>
+    </w:lvl>
+  </w:abstractNum>
   <w:num w:numId="1">
     <w:abstractNumId w:val="8"/>
   </w:num>
@@ -625,6 +889,15 @@
   </w:num>
   <w:num w:numId="1000">
     <w:abstractNumId w:val="990"/>
+  </w:num>
+  <w:num w:numId="1001">
+    <w:abstractNumId w:val="991"/>
+  </w:num>
+  <w:num w:numId="1002">
+    <w:abstractNumId w:val="991"/>
+  </w:num>
+  <w:num w:numId="1003">
+    <w:abstractNumId w:val="991"/>
   </w:num>
 </w:numbering>
 </file>

</xml_diff>

<commit_message>
fix(bai-tap): reverse rule 3 — no academic citations in solutions
- Rewrite ATTT solution.md to practitioner voice (pháo đài metaphor,
  CIA integration, SQL Injection/XSS/ORM/CSP/MFA/EDR/SOC examples,
  pros/cons of DiD, tie-in with Hacking Phases at end); no cite
- Remove all "(Bài X tr.Y)" and "chương 5 (Analysis)" citations from
  BPM + ATTT solution.md; keep light natural references only
- Rebuild both docx/pdf
- Update feedback-baitap-format-and-evidence rule 3: from
  "must cite chapter" to "must NOT cite academic-style"; explain
  why via Round 2 review
</commit_message>
<xml_diff>
--- a/2026-07-07/output/24730090.docx
+++ b/2026-07-07/output/24730090.docx
@@ -213,7 +213,7 @@
         <w:rPr>
           <w:color w:val="000000"/>
         </w:rPr>
-        <w:t xml:space="preserve">Theo định nghĩa trong bài giảng chương 1, một quy trình được kích hoạt bởi một nhu cầu và tạo ra kết quả có giá trị cho khách hàng. Từ đó suy ra customer là bên có nhu cầu ở đầu quy trình và nhận value ở cuối, tức là bên có state thay đổi vì quy trình chạy. Bên chỉ thực thi các bước bên trong (executor) thì không phải customer, họ tạo ra value chứ không tiêu thụ. Áp cách hiểu này vào sơ đồ đề bài thì sơ đồ chưa vẽ ra customer thật sự.</w:t>
+        <w:t xml:space="preserve">Theo cách hiểu mà bài giảng đã đưa ra, một quy trình được kích hoạt bởi một nhu cầu và tạo ra kết quả có giá trị cho khách hàng. Từ đó suy ra customer là bên có nhu cầu ở đầu quy trình và nhận value ở cuối, tức là bên có state thay đổi vì quy trình chạy. Bên chỉ thực thi các bước bên trong (executor) thì không phải customer, họ tạo ra value chứ không tiêu thụ. Áp cách hiểu này vào sơ đồ đề bài thì sơ đồ chưa vẽ ra customer thật sự.</w:t>
       </w:r>
     </w:p>
     <w:p>
@@ -224,7 +224,7 @@
         <w:rPr>
           <w:color w:val="000000"/>
         </w:rPr>
-        <w:t xml:space="preserve">Trong một quy trình procure-to-pay, customer là các phòng ban sử dụng cuối như sản xuất, R&amp;D, dự án hay công trường, tức là bên đã gửi purchase requisition ban đầu. Họ có nhu cầu (thiếu vật tư để làm việc) và nhận value cuối cùng (được có vật tư để dùng). Purchasing Department chỉ tiếp nhận requisition đó rồi thực thi thay, tương tự bài BuildIT ở chương 5 (Analysis), nơi clerk và works engineer là executor xử lý request thuê thiết bị, còn customer thật là site engineer bên có nhu cầu thiếu thiết bị.</w:t>
+        <w:t xml:space="preserve">Trong một quy trình procure-to-pay, customer là các phòng ban sử dụng cuối như sản xuất, R&amp;D, dự án hay công trường, tức là bên đã gửi purchase requisition ban đầu. Họ có nhu cầu (thiếu vật tư để làm việc) và nhận value cuối cùng (được có vật tư để dùng). Purchasing Department chỉ tiếp nhận requisition đó rồi thực thi thay, tương tự bài BuildIT tuần trước, nơi clerk và works engineer là executor xử lý request thuê thiết bị, còn customer thật là site engineer bên có nhu cầu thiếu thiết bị.</w:t>
       </w:r>
     </w:p>
     <w:p>

</xml_diff>